<commit_message>
Project report (IKGPTU format), roll number filled in
stuff/docs/report/: a 40-page project report in the structure of the
university reference report: title page with the university crest,
certificate, acknowledgement, contents with real page ranges, abstract
and 20 chapters (problem, literature review, objectives, methodology,
architecture, technology, four module chapters, data flow and use case
diagrams, implementation, testing, results, limitations, future scope,
conclusion, references), with 9 figures. Roll number 2328069 filled in
on the deck title slide and the synopsis.

Co-Authored-By: Claude Opus 5.5 <noreply@anthropic.com>
</commit_message>
<xml_diff>
--- a/stuff/docs/synopsis/Pramana_Synopsis.docx
+++ b/stuff/docs/synopsis/Pramana_Synopsis.docx
@@ -123,7 +123,7 @@
         <w:jc w:val="center"/>
       </w:pPr>
       <w:r>
-        <w:t>University Roll No.: ____________________</w:t>
+        <w:t>University Roll No.: 2328069</w:t>
       </w:r>
     </w:p>
     <w:p>
@@ -253,7 +253,7 @@
     <w:sdt>
       <w:sdtPr>
         <w:alias w:val="Contents"/>
-        <w:id w:val="666671978"/>
+        <w:id w:val="640080463"/>
       </w:sdtPr>
       <w:sdtEndPr/>
       <w:sdtContent>
@@ -279,7 +279,7 @@
           <w:r>
             <w:fldChar w:fldCharType="separate"/>
           </w:r>
-          <w:hyperlink w:anchor="_Toc243254868" w:history="1">
+          <w:hyperlink w:anchor="_Toc243261759" w:history="1">
             <w:r>
               <w:rPr>
                 <w:rStyle w:val="Hyperlink"/>
@@ -303,7 +303,7 @@
               <w:rPr>
                 <w:noProof/>
               </w:rPr>
-              <w:instrText xml:space="preserve"> PAGEREF _Toc243254868 \h </w:instrText>
+              <w:instrText xml:space="preserve"> PAGEREF _Toc243261759 \h </w:instrText>
             </w:r>
             <w:r>
               <w:rPr>
@@ -343,7 +343,7 @@
               <w14:ligatures w14:val="standardContextual"/>
             </w:rPr>
           </w:pPr>
-          <w:hyperlink w:anchor="_Toc243254869" w:history="1">
+          <w:hyperlink w:anchor="_Toc243261760" w:history="1">
             <w:r>
               <w:rPr>
                 <w:rStyle w:val="Hyperlink"/>
@@ -367,7 +367,7 @@
               <w:rPr>
                 <w:noProof/>
               </w:rPr>
-              <w:instrText xml:space="preserve"> PAGEREF _Toc243254869 \h </w:instrText>
+              <w:instrText xml:space="preserve"> PAGEREF _Toc243261760 \h </w:instrText>
             </w:r>
             <w:r>
               <w:rPr>
@@ -407,7 +407,7 @@
               <w14:ligatures w14:val="standardContextual"/>
             </w:rPr>
           </w:pPr>
-          <w:hyperlink w:anchor="_Toc243254870" w:history="1">
+          <w:hyperlink w:anchor="_Toc243261761" w:history="1">
             <w:r>
               <w:rPr>
                 <w:rStyle w:val="Hyperlink"/>
@@ -431,7 +431,7 @@
               <w:rPr>
                 <w:noProof/>
               </w:rPr>
-              <w:instrText xml:space="preserve"> PAGEREF _Toc243254870 \h </w:instrText>
+              <w:instrText xml:space="preserve"> PAGEREF _Toc243261761 \h </w:instrText>
             </w:r>
             <w:r>
               <w:rPr>
@@ -471,7 +471,7 @@
               <w14:ligatures w14:val="standardContextual"/>
             </w:rPr>
           </w:pPr>
-          <w:hyperlink w:anchor="_Toc243254871" w:history="1">
+          <w:hyperlink w:anchor="_Toc243261762" w:history="1">
             <w:r>
               <w:rPr>
                 <w:rStyle w:val="Hyperlink"/>
@@ -495,7 +495,7 @@
               <w:rPr>
                 <w:noProof/>
               </w:rPr>
-              <w:instrText xml:space="preserve"> PAGEREF _Toc243254871 \h </w:instrText>
+              <w:instrText xml:space="preserve"> PAGEREF _Toc243261762 \h </w:instrText>
             </w:r>
             <w:r>
               <w:rPr>
@@ -535,7 +535,7 @@
               <w14:ligatures w14:val="standardContextual"/>
             </w:rPr>
           </w:pPr>
-          <w:hyperlink w:anchor="_Toc243254872" w:history="1">
+          <w:hyperlink w:anchor="_Toc243261763" w:history="1">
             <w:r>
               <w:rPr>
                 <w:rStyle w:val="Hyperlink"/>
@@ -559,7 +559,7 @@
               <w:rPr>
                 <w:noProof/>
               </w:rPr>
-              <w:instrText xml:space="preserve"> PAGEREF _Toc243254872 \h </w:instrText>
+              <w:instrText xml:space="preserve"> PAGEREF _Toc243261763 \h </w:instrText>
             </w:r>
             <w:r>
               <w:rPr>
@@ -599,7 +599,7 @@
               <w14:ligatures w14:val="standardContextual"/>
             </w:rPr>
           </w:pPr>
-          <w:hyperlink w:anchor="_Toc243254873" w:history="1">
+          <w:hyperlink w:anchor="_Toc243261764" w:history="1">
             <w:r>
               <w:rPr>
                 <w:rStyle w:val="Hyperlink"/>
@@ -623,7 +623,7 @@
               <w:rPr>
                 <w:noProof/>
               </w:rPr>
-              <w:instrText xml:space="preserve"> PAGEREF _Toc243254873 \h </w:instrText>
+              <w:instrText xml:space="preserve"> PAGEREF _Toc243261764 \h </w:instrText>
             </w:r>
             <w:r>
               <w:rPr>
@@ -663,7 +663,7 @@
               <w14:ligatures w14:val="standardContextual"/>
             </w:rPr>
           </w:pPr>
-          <w:hyperlink w:anchor="_Toc243254874" w:history="1">
+          <w:hyperlink w:anchor="_Toc243261765" w:history="1">
             <w:r>
               <w:rPr>
                 <w:rStyle w:val="Hyperlink"/>
@@ -687,7 +687,7 @@
               <w:rPr>
                 <w:noProof/>
               </w:rPr>
-              <w:instrText xml:space="preserve"> PAGEREF _Toc243254874 \h </w:instrText>
+              <w:instrText xml:space="preserve"> PAGEREF _Toc243261765 \h </w:instrText>
             </w:r>
             <w:r>
               <w:rPr>
@@ -727,7 +727,7 @@
               <w14:ligatures w14:val="standardContextual"/>
             </w:rPr>
           </w:pPr>
-          <w:hyperlink w:anchor="_Toc243254875" w:history="1">
+          <w:hyperlink w:anchor="_Toc243261766" w:history="1">
             <w:r>
               <w:rPr>
                 <w:rStyle w:val="Hyperlink"/>
@@ -751,7 +751,7 @@
               <w:rPr>
                 <w:noProof/>
               </w:rPr>
-              <w:instrText xml:space="preserve"> PAGEREF _Toc243254875 \h </w:instrText>
+              <w:instrText xml:space="preserve"> PAGEREF _Toc243261766 \h </w:instrText>
             </w:r>
             <w:r>
               <w:rPr>
@@ -791,7 +791,7 @@
               <w14:ligatures w14:val="standardContextual"/>
             </w:rPr>
           </w:pPr>
-          <w:hyperlink w:anchor="_Toc243254876" w:history="1">
+          <w:hyperlink w:anchor="_Toc243261767" w:history="1">
             <w:r>
               <w:rPr>
                 <w:rStyle w:val="Hyperlink"/>
@@ -815,7 +815,7 @@
               <w:rPr>
                 <w:noProof/>
               </w:rPr>
-              <w:instrText xml:space="preserve"> PAGEREF _Toc243254876 \h </w:instrText>
+              <w:instrText xml:space="preserve"> PAGEREF _Toc243261767 \h </w:instrText>
             </w:r>
             <w:r>
               <w:rPr>
@@ -855,7 +855,7 @@
               <w14:ligatures w14:val="standardContextual"/>
             </w:rPr>
           </w:pPr>
-          <w:hyperlink w:anchor="_Toc243254877" w:history="1">
+          <w:hyperlink w:anchor="_Toc243261768" w:history="1">
             <w:r>
               <w:rPr>
                 <w:rStyle w:val="Hyperlink"/>
@@ -879,7 +879,7 @@
               <w:rPr>
                 <w:noProof/>
               </w:rPr>
-              <w:instrText xml:space="preserve"> PAGEREF _Toc243254877 \h </w:instrText>
+              <w:instrText xml:space="preserve"> PAGEREF _Toc243261768 \h </w:instrText>
             </w:r>
             <w:r>
               <w:rPr>
@@ -919,7 +919,7 @@
               <w14:ligatures w14:val="standardContextual"/>
             </w:rPr>
           </w:pPr>
-          <w:hyperlink w:anchor="_Toc243254878" w:history="1">
+          <w:hyperlink w:anchor="_Toc243261769" w:history="1">
             <w:r>
               <w:rPr>
                 <w:rStyle w:val="Hyperlink"/>
@@ -943,7 +943,7 @@
               <w:rPr>
                 <w:noProof/>
               </w:rPr>
-              <w:instrText xml:space="preserve"> PAGEREF _Toc243254878 \h </w:instrText>
+              <w:instrText xml:space="preserve"> PAGEREF _Toc243261769 \h </w:instrText>
             </w:r>
             <w:r>
               <w:rPr>
@@ -983,7 +983,7 @@
               <w14:ligatures w14:val="standardContextual"/>
             </w:rPr>
           </w:pPr>
-          <w:hyperlink w:anchor="_Toc243254879" w:history="1">
+          <w:hyperlink w:anchor="_Toc243261770" w:history="1">
             <w:r>
               <w:rPr>
                 <w:rStyle w:val="Hyperlink"/>
@@ -1007,7 +1007,7 @@
               <w:rPr>
                 <w:noProof/>
               </w:rPr>
-              <w:instrText xml:space="preserve"> PAGEREF _Toc243254879 \h </w:instrText>
+              <w:instrText xml:space="preserve"> PAGEREF _Toc243261770 \h </w:instrText>
             </w:r>
             <w:r>
               <w:rPr>
@@ -1047,7 +1047,7 @@
               <w14:ligatures w14:val="standardContextual"/>
             </w:rPr>
           </w:pPr>
-          <w:hyperlink w:anchor="_Toc243254880" w:history="1">
+          <w:hyperlink w:anchor="_Toc243261771" w:history="1">
             <w:r>
               <w:rPr>
                 <w:rStyle w:val="Hyperlink"/>
@@ -1071,7 +1071,7 @@
               <w:rPr>
                 <w:noProof/>
               </w:rPr>
-              <w:instrText xml:space="preserve"> PAGEREF _Toc243254880 \h </w:instrText>
+              <w:instrText xml:space="preserve"> PAGEREF _Toc243261771 \h </w:instrText>
             </w:r>
             <w:r>
               <w:rPr>
@@ -1111,7 +1111,7 @@
               <w14:ligatures w14:val="standardContextual"/>
             </w:rPr>
           </w:pPr>
-          <w:hyperlink w:anchor="_Toc243254881" w:history="1">
+          <w:hyperlink w:anchor="_Toc243261772" w:history="1">
             <w:r>
               <w:rPr>
                 <w:rStyle w:val="Hyperlink"/>
@@ -1135,7 +1135,7 @@
               <w:rPr>
                 <w:noProof/>
               </w:rPr>
-              <w:instrText xml:space="preserve"> PAGEREF _Toc243254881 \h </w:instrText>
+              <w:instrText xml:space="preserve"> PAGEREF _Toc243261772 \h </w:instrText>
             </w:r>
             <w:r>
               <w:rPr>
@@ -1175,7 +1175,7 @@
               <w14:ligatures w14:val="standardContextual"/>
             </w:rPr>
           </w:pPr>
-          <w:hyperlink w:anchor="_Toc243254882" w:history="1">
+          <w:hyperlink w:anchor="_Toc243261773" w:history="1">
             <w:r>
               <w:rPr>
                 <w:rStyle w:val="Hyperlink"/>
@@ -1199,7 +1199,7 @@
               <w:rPr>
                 <w:noProof/>
               </w:rPr>
-              <w:instrText xml:space="preserve"> PAGEREF _Toc243254882 \h </w:instrText>
+              <w:instrText xml:space="preserve"> PAGEREF _Toc243261773 \h </w:instrText>
             </w:r>
             <w:r>
               <w:rPr>
@@ -1239,7 +1239,7 @@
               <w14:ligatures w14:val="standardContextual"/>
             </w:rPr>
           </w:pPr>
-          <w:hyperlink w:anchor="_Toc243254883" w:history="1">
+          <w:hyperlink w:anchor="_Toc243261774" w:history="1">
             <w:r>
               <w:rPr>
                 <w:rStyle w:val="Hyperlink"/>
@@ -1263,7 +1263,7 @@
               <w:rPr>
                 <w:noProof/>
               </w:rPr>
-              <w:instrText xml:space="preserve"> PAGEREF _Toc243254883 \h </w:instrText>
+              <w:instrText xml:space="preserve"> PAGEREF _Toc243261774 \h </w:instrText>
             </w:r>
             <w:r>
               <w:rPr>
@@ -1303,7 +1303,7 @@
               <w14:ligatures w14:val="standardContextual"/>
             </w:rPr>
           </w:pPr>
-          <w:hyperlink w:anchor="_Toc243254884" w:history="1">
+          <w:hyperlink w:anchor="_Toc243261775" w:history="1">
             <w:r>
               <w:rPr>
                 <w:rStyle w:val="Hyperlink"/>
@@ -1327,7 +1327,7 @@
               <w:rPr>
                 <w:noProof/>
               </w:rPr>
-              <w:instrText xml:space="preserve"> PAGEREF _Toc243254884 \h </w:instrText>
+              <w:instrText xml:space="preserve"> PAGEREF _Toc243261775 \h </w:instrText>
             </w:r>
             <w:r>
               <w:rPr>
@@ -1367,7 +1367,7 @@
               <w14:ligatures w14:val="standardContextual"/>
             </w:rPr>
           </w:pPr>
-          <w:hyperlink w:anchor="_Toc243254885" w:history="1">
+          <w:hyperlink w:anchor="_Toc243261776" w:history="1">
             <w:r>
               <w:rPr>
                 <w:rStyle w:val="Hyperlink"/>
@@ -1391,7 +1391,7 @@
               <w:rPr>
                 <w:noProof/>
               </w:rPr>
-              <w:instrText xml:space="preserve"> PAGEREF _Toc243254885 \h </w:instrText>
+              <w:instrText xml:space="preserve"> PAGEREF _Toc243261776 \h </w:instrText>
             </w:r>
             <w:r>
               <w:rPr>
@@ -1431,7 +1431,7 @@
               <w14:ligatures w14:val="standardContextual"/>
             </w:rPr>
           </w:pPr>
-          <w:hyperlink w:anchor="_Toc243254886" w:history="1">
+          <w:hyperlink w:anchor="_Toc243261777" w:history="1">
             <w:r>
               <w:rPr>
                 <w:rStyle w:val="Hyperlink"/>
@@ -1455,7 +1455,7 @@
               <w:rPr>
                 <w:noProof/>
               </w:rPr>
-              <w:instrText xml:space="preserve"> PAGEREF _Toc243254886 \h </w:instrText>
+              <w:instrText xml:space="preserve"> PAGEREF _Toc243261777 \h </w:instrText>
             </w:r>
             <w:r>
               <w:rPr>
@@ -1495,7 +1495,7 @@
               <w14:ligatures w14:val="standardContextual"/>
             </w:rPr>
           </w:pPr>
-          <w:hyperlink w:anchor="_Toc243254887" w:history="1">
+          <w:hyperlink w:anchor="_Toc243261778" w:history="1">
             <w:r>
               <w:rPr>
                 <w:rStyle w:val="Hyperlink"/>
@@ -1519,7 +1519,7 @@
               <w:rPr>
                 <w:noProof/>
               </w:rPr>
-              <w:instrText xml:space="preserve"> PAGEREF _Toc243254887 \h </w:instrText>
+              <w:instrText xml:space="preserve"> PAGEREF _Toc243261778 \h </w:instrText>
             </w:r>
             <w:r>
               <w:rPr>
@@ -1559,7 +1559,7 @@
               <w14:ligatures w14:val="standardContextual"/>
             </w:rPr>
           </w:pPr>
-          <w:hyperlink w:anchor="_Toc243254888" w:history="1">
+          <w:hyperlink w:anchor="_Toc243261779" w:history="1">
             <w:r>
               <w:rPr>
                 <w:rStyle w:val="Hyperlink"/>
@@ -1583,7 +1583,7 @@
               <w:rPr>
                 <w:noProof/>
               </w:rPr>
-              <w:instrText xml:space="preserve"> PAGEREF _Toc243254888 \h </w:instrText>
+              <w:instrText xml:space="preserve"> PAGEREF _Toc243261779 \h </w:instrText>
             </w:r>
             <w:r>
               <w:rPr>
@@ -1623,7 +1623,7 @@
               <w14:ligatures w14:val="standardContextual"/>
             </w:rPr>
           </w:pPr>
-          <w:hyperlink w:anchor="_Toc243254889" w:history="1">
+          <w:hyperlink w:anchor="_Toc243261780" w:history="1">
             <w:r>
               <w:rPr>
                 <w:rStyle w:val="Hyperlink"/>
@@ -1647,7 +1647,7 @@
               <w:rPr>
                 <w:noProof/>
               </w:rPr>
-              <w:instrText xml:space="preserve"> PAGEREF _Toc243254889 \h </w:instrText>
+              <w:instrText xml:space="preserve"> PAGEREF _Toc243261780 \h </w:instrText>
             </w:r>
             <w:r>
               <w:rPr>
@@ -1687,7 +1687,7 @@
               <w14:ligatures w14:val="standardContextual"/>
             </w:rPr>
           </w:pPr>
-          <w:hyperlink w:anchor="_Toc243254890" w:history="1">
+          <w:hyperlink w:anchor="_Toc243261781" w:history="1">
             <w:r>
               <w:rPr>
                 <w:rStyle w:val="Hyperlink"/>
@@ -1711,7 +1711,7 @@
               <w:rPr>
                 <w:noProof/>
               </w:rPr>
-              <w:instrText xml:space="preserve"> PAGEREF _Toc243254890 \h </w:instrText>
+              <w:instrText xml:space="preserve"> PAGEREF _Toc243261781 \h </w:instrText>
             </w:r>
             <w:r>
               <w:rPr>
@@ -1751,7 +1751,7 @@
               <w14:ligatures w14:val="standardContextual"/>
             </w:rPr>
           </w:pPr>
-          <w:hyperlink w:anchor="_Toc243254891" w:history="1">
+          <w:hyperlink w:anchor="_Toc243261782" w:history="1">
             <w:r>
               <w:rPr>
                 <w:rStyle w:val="Hyperlink"/>
@@ -1775,7 +1775,7 @@
               <w:rPr>
                 <w:noProof/>
               </w:rPr>
-              <w:instrText xml:space="preserve"> PAGEREF _Toc243254891 \h </w:instrText>
+              <w:instrText xml:space="preserve"> PAGEREF _Toc243261782 \h </w:instrText>
             </w:r>
             <w:r>
               <w:rPr>
@@ -1815,7 +1815,7 @@
               <w14:ligatures w14:val="standardContextual"/>
             </w:rPr>
           </w:pPr>
-          <w:hyperlink w:anchor="_Toc243254892" w:history="1">
+          <w:hyperlink w:anchor="_Toc243261783" w:history="1">
             <w:r>
               <w:rPr>
                 <w:rStyle w:val="Hyperlink"/>
@@ -1839,7 +1839,7 @@
               <w:rPr>
                 <w:noProof/>
               </w:rPr>
-              <w:instrText xml:space="preserve"> PAGEREF _Toc243254892 \h </w:instrText>
+              <w:instrText xml:space="preserve"> PAGEREF _Toc243261783 \h </w:instrText>
             </w:r>
             <w:r>
               <w:rPr>
@@ -1879,7 +1879,7 @@
               <w14:ligatures w14:val="standardContextual"/>
             </w:rPr>
           </w:pPr>
-          <w:hyperlink w:anchor="_Toc243254893" w:history="1">
+          <w:hyperlink w:anchor="_Toc243261784" w:history="1">
             <w:r>
               <w:rPr>
                 <w:rStyle w:val="Hyperlink"/>
@@ -1903,7 +1903,7 @@
               <w:rPr>
                 <w:noProof/>
               </w:rPr>
-              <w:instrText xml:space="preserve"> PAGEREF _Toc243254893 \h </w:instrText>
+              <w:instrText xml:space="preserve"> PAGEREF _Toc243261784 \h </w:instrText>
             </w:r>
             <w:r>
               <w:rPr>
@@ -1943,7 +1943,7 @@
               <w14:ligatures w14:val="standardContextual"/>
             </w:rPr>
           </w:pPr>
-          <w:hyperlink w:anchor="_Toc243254894" w:history="1">
+          <w:hyperlink w:anchor="_Toc243261785" w:history="1">
             <w:r>
               <w:rPr>
                 <w:rStyle w:val="Hyperlink"/>
@@ -1967,7 +1967,7 @@
               <w:rPr>
                 <w:noProof/>
               </w:rPr>
-              <w:instrText xml:space="preserve"> PAGEREF _Toc243254894 \h </w:instrText>
+              <w:instrText xml:space="preserve"> PAGEREF _Toc243261785 \h </w:instrText>
             </w:r>
             <w:r>
               <w:rPr>
@@ -2007,7 +2007,7 @@
               <w14:ligatures w14:val="standardContextual"/>
             </w:rPr>
           </w:pPr>
-          <w:hyperlink w:anchor="_Toc243254895" w:history="1">
+          <w:hyperlink w:anchor="_Toc243261786" w:history="1">
             <w:r>
               <w:rPr>
                 <w:rStyle w:val="Hyperlink"/>
@@ -2031,7 +2031,7 @@
               <w:rPr>
                 <w:noProof/>
               </w:rPr>
-              <w:instrText xml:space="preserve"> PAGEREF _Toc243254895 \h </w:instrText>
+              <w:instrText xml:space="preserve"> PAGEREF _Toc243261786 \h </w:instrText>
             </w:r>
             <w:r>
               <w:rPr>
@@ -2071,7 +2071,7 @@
               <w14:ligatures w14:val="standardContextual"/>
             </w:rPr>
           </w:pPr>
-          <w:hyperlink w:anchor="_Toc243254896" w:history="1">
+          <w:hyperlink w:anchor="_Toc243261787" w:history="1">
             <w:r>
               <w:rPr>
                 <w:rStyle w:val="Hyperlink"/>
@@ -2095,7 +2095,7 @@
               <w:rPr>
                 <w:noProof/>
               </w:rPr>
-              <w:instrText xml:space="preserve"> PAGEREF _Toc243254896 \h </w:instrText>
+              <w:instrText xml:space="preserve"> PAGEREF _Toc243261787 \h </w:instrText>
             </w:r>
             <w:r>
               <w:rPr>
@@ -2135,7 +2135,7 @@
               <w14:ligatures w14:val="standardContextual"/>
             </w:rPr>
           </w:pPr>
-          <w:hyperlink w:anchor="_Toc243254897" w:history="1">
+          <w:hyperlink w:anchor="_Toc243261788" w:history="1">
             <w:r>
               <w:rPr>
                 <w:rStyle w:val="Hyperlink"/>
@@ -2159,7 +2159,7 @@
               <w:rPr>
                 <w:noProof/>
               </w:rPr>
-              <w:instrText xml:space="preserve"> PAGEREF _Toc243254897 \h </w:instrText>
+              <w:instrText xml:space="preserve"> PAGEREF _Toc243261788 \h </w:instrText>
             </w:r>
             <w:r>
               <w:rPr>
@@ -2199,7 +2199,7 @@
               <w14:ligatures w14:val="standardContextual"/>
             </w:rPr>
           </w:pPr>
-          <w:hyperlink w:anchor="_Toc243254898" w:history="1">
+          <w:hyperlink w:anchor="_Toc243261789" w:history="1">
             <w:r>
               <w:rPr>
                 <w:rStyle w:val="Hyperlink"/>
@@ -2223,7 +2223,7 @@
               <w:rPr>
                 <w:noProof/>
               </w:rPr>
-              <w:instrText xml:space="preserve"> PAGEREF _Toc243254898 \h </w:instrText>
+              <w:instrText xml:space="preserve"> PAGEREF _Toc243261789 \h </w:instrText>
             </w:r>
             <w:r>
               <w:rPr>
@@ -2263,7 +2263,7 @@
               <w14:ligatures w14:val="standardContextual"/>
             </w:rPr>
           </w:pPr>
-          <w:hyperlink w:anchor="_Toc243254899" w:history="1">
+          <w:hyperlink w:anchor="_Toc243261790" w:history="1">
             <w:r>
               <w:rPr>
                 <w:rStyle w:val="Hyperlink"/>
@@ -2287,7 +2287,7 @@
               <w:rPr>
                 <w:noProof/>
               </w:rPr>
-              <w:instrText xml:space="preserve"> PAGEREF _Toc243254899 \h </w:instrText>
+              <w:instrText xml:space="preserve"> PAGEREF _Toc243261790 \h </w:instrText>
             </w:r>
             <w:r>
               <w:rPr>
@@ -2327,7 +2327,7 @@
         <w:keepNext/>
         <w:pageBreakBefore/>
       </w:pPr>
-      <w:bookmarkStart w:id="0" w:name="_Toc243254868"/>
+      <w:bookmarkStart w:id="0" w:name="_Toc243261759"/>
       <w:r>
         <w:lastRenderedPageBreak/>
         <w:t>Abstract</w:t>
@@ -2409,7 +2409,7 @@
         <w:keepNext/>
         <w:pageBreakBefore/>
       </w:pPr>
-      <w:bookmarkStart w:id="1" w:name="_Toc243254869"/>
+      <w:bookmarkStart w:id="1" w:name="_Toc243261760"/>
       <w:r>
         <w:lastRenderedPageBreak/>
         <w:t>1. Introduction</w:t>
@@ -2455,7 +2455,7 @@
         <w:keepNext/>
         <w:spacing w:before="360"/>
       </w:pPr>
-      <w:bookmarkStart w:id="2" w:name="_Toc243254870"/>
+      <w:bookmarkStart w:id="2" w:name="_Toc243261761"/>
       <w:r>
         <w:t>2. Problem Statement and Motivation</w:t>
       </w:r>
@@ -2466,7 +2466,7 @@
         <w:pStyle w:val="Heading2"/>
         <w:keepNext/>
       </w:pPr>
-      <w:bookmarkStart w:id="3" w:name="_Toc243254871"/>
+      <w:bookmarkStart w:id="3" w:name="_Toc243261762"/>
       <w:r>
         <w:t>2.1 Problem statement</w:t>
       </w:r>
@@ -2496,7 +2496,7 @@
         <w:pStyle w:val="Heading2"/>
         <w:keepNext/>
       </w:pPr>
-      <w:bookmarkStart w:id="4" w:name="_Toc243254872"/>
+      <w:bookmarkStart w:id="4" w:name="_Toc243261763"/>
       <w:r>
         <w:lastRenderedPageBreak/>
         <w:t>2.2 Motivation</w:t>
@@ -2614,7 +2614,7 @@
         <w:keepNext/>
         <w:spacing w:before="360"/>
       </w:pPr>
-      <w:bookmarkStart w:id="5" w:name="_Toc243254873"/>
+      <w:bookmarkStart w:id="5" w:name="_Toc243261764"/>
       <w:r>
         <w:t>3. Objectives</w:t>
       </w:r>
@@ -2768,7 +2768,7 @@
         <w:keepNext/>
         <w:spacing w:before="360"/>
       </w:pPr>
-      <w:bookmarkStart w:id="6" w:name="_Toc243254874"/>
+      <w:bookmarkStart w:id="6" w:name="_Toc243261765"/>
       <w:r>
         <w:t>4. Literature Survey</w:t>
       </w:r>
@@ -3875,7 +3875,7 @@
         <w:pStyle w:val="Heading2"/>
         <w:keepNext/>
       </w:pPr>
-      <w:bookmarkStart w:id="7" w:name="_Toc243254875"/>
+      <w:bookmarkStart w:id="7" w:name="_Toc243261766"/>
       <w:r>
         <w:lastRenderedPageBreak/>
         <w:t>4.1 Research gap</w:t>
@@ -3900,7 +3900,7 @@
         <w:keepNext/>
         <w:spacing w:before="360"/>
       </w:pPr>
-      <w:bookmarkStart w:id="8" w:name="_Toc243254876"/>
+      <w:bookmarkStart w:id="8" w:name="_Toc243261767"/>
       <w:r>
         <w:t>5. Feasibility Study</w:t>
       </w:r>
@@ -3911,7 +3911,7 @@
         <w:pStyle w:val="Heading2"/>
         <w:keepNext/>
       </w:pPr>
-      <w:bookmarkStart w:id="9" w:name="_Toc243254877"/>
+      <w:bookmarkStart w:id="9" w:name="_Toc243261768"/>
       <w:r>
         <w:t>5.1 Technical feasibility</w:t>
       </w:r>
@@ -3941,7 +3941,7 @@
         <w:pStyle w:val="Heading2"/>
         <w:keepNext/>
       </w:pPr>
-      <w:bookmarkStart w:id="10" w:name="_Toc243254878"/>
+      <w:bookmarkStart w:id="10" w:name="_Toc243261769"/>
       <w:r>
         <w:t>5.2 Economic feasibility</w:t>
       </w:r>
@@ -3971,7 +3971,7 @@
         <w:pStyle w:val="Heading2"/>
         <w:keepNext/>
       </w:pPr>
-      <w:bookmarkStart w:id="11" w:name="_Toc243254879"/>
+      <w:bookmarkStart w:id="11" w:name="_Toc243261770"/>
       <w:r>
         <w:t>5.3 Operational feasibility</w:t>
       </w:r>
@@ -3992,7 +3992,7 @@
         <w:keepNext/>
         <w:spacing w:before="360"/>
       </w:pPr>
-      <w:bookmarkStart w:id="12" w:name="_Toc243254880"/>
+      <w:bookmarkStart w:id="12" w:name="_Toc243261771"/>
       <w:r>
         <w:lastRenderedPageBreak/>
         <w:t>6. Proposed System and Methodology</w:t>
@@ -4004,7 +4004,7 @@
         <w:pStyle w:val="Heading2"/>
         <w:keepNext/>
       </w:pPr>
-      <w:bookmarkStart w:id="13" w:name="_Toc243254881"/>
+      <w:bookmarkStart w:id="13" w:name="_Toc243261772"/>
       <w:r>
         <w:t>6.1 System architecture</w:t>
       </w:r>
@@ -4030,7 +4030,7 @@
           <w:noProof/>
         </w:rPr>
         <w:drawing>
-          <wp:inline distT="0" distB="0" distL="0" distR="0" wp14:anchorId="6D2FA9F1" wp14:editId="58977C88">
+          <wp:inline distT="0" distB="0" distL="0" distR="0" wp14:anchorId="63049789" wp14:editId="42364AC5">
             <wp:extent cx="5334000" cy="3009900"/>
             <wp:effectExtent l="0" t="0" r="0" b="0"/>
             <wp:docPr id="1" name="Picture 1"/>
@@ -4089,7 +4089,7 @@
         <w:pStyle w:val="Heading2"/>
         <w:keepNext/>
       </w:pPr>
-      <w:bookmarkStart w:id="14" w:name="_Toc243254882"/>
+      <w:bookmarkStart w:id="14" w:name="_Toc243261773"/>
       <w:r>
         <w:t>6.2 Modules</w:t>
       </w:r>
@@ -4321,7 +4321,7 @@
         <w:pStyle w:val="Heading2"/>
         <w:keepNext/>
       </w:pPr>
-      <w:bookmarkStart w:id="15" w:name="_Toc243254883"/>
+      <w:bookmarkStart w:id="15" w:name="_Toc243261774"/>
       <w:r>
         <w:lastRenderedPageBreak/>
         <w:t>6.3 Dataset</w:t>
@@ -5227,7 +5227,7 @@
         <w:pStyle w:val="Heading2"/>
         <w:keepNext/>
       </w:pPr>
-      <w:bookmarkStart w:id="16" w:name="_Toc243254884"/>
+      <w:bookmarkStart w:id="16" w:name="_Toc243261775"/>
       <w:r>
         <w:t>6.4 Development methodology</w:t>
       </w:r>
@@ -5248,7 +5248,7 @@
         <w:keepNext/>
         <w:spacing w:before="360"/>
       </w:pPr>
-      <w:bookmarkStart w:id="17" w:name="_Toc243254885"/>
+      <w:bookmarkStart w:id="17" w:name="_Toc243261776"/>
       <w:r>
         <w:lastRenderedPageBreak/>
         <w:t>7. Hardware and Software Requirements</w:t>
@@ -6669,7 +6669,7 @@
         <w:keepNext/>
         <w:spacing w:before="360"/>
       </w:pPr>
-      <w:bookmarkStart w:id="18" w:name="_Toc243254886"/>
+      <w:bookmarkStart w:id="18" w:name="_Toc243261777"/>
       <w:r>
         <w:t>8. Testing, Evaluation and Results</w:t>
       </w:r>
@@ -6689,7 +6689,7 @@
         <w:pStyle w:val="Heading2"/>
         <w:keepNext/>
       </w:pPr>
-      <w:bookmarkStart w:id="19" w:name="_Toc243254887"/>
+      <w:bookmarkStart w:id="19" w:name="_Toc243261778"/>
       <w:r>
         <w:t>8.1 Citation verification</w:t>
       </w:r>
@@ -7245,7 +7245,7 @@
         <w:pStyle w:val="Heading2"/>
         <w:keepNext/>
       </w:pPr>
-      <w:bookmarkStart w:id="20" w:name="_Toc243254888"/>
+      <w:bookmarkStart w:id="20" w:name="_Toc243261779"/>
       <w:r>
         <w:t>8.2 Retrieval</w:t>
       </w:r>
@@ -7265,7 +7265,7 @@
         <w:pStyle w:val="Heading2"/>
         <w:keepNext/>
       </w:pPr>
-      <w:bookmarkStart w:id="21" w:name="_Toc243254889"/>
+      <w:bookmarkStart w:id="21" w:name="_Toc243261780"/>
       <w:r>
         <w:t>8.3 End-to-end statute identification</w:t>
       </w:r>
@@ -7852,7 +7852,7 @@
         <w:pStyle w:val="Heading2"/>
         <w:keepNext/>
       </w:pPr>
-      <w:bookmarkStart w:id="22" w:name="_Toc243254890"/>
+      <w:bookmarkStart w:id="22" w:name="_Toc243261781"/>
       <w:r>
         <w:t>8.4 IL-TUR benchmark</w:t>
       </w:r>
@@ -8554,7 +8554,7 @@
         <w:pStyle w:val="Heading2"/>
         <w:keepNext/>
       </w:pPr>
-      <w:bookmarkStart w:id="23" w:name="_Toc243254891"/>
+      <w:bookmarkStart w:id="23" w:name="_Toc243261782"/>
       <w:r>
         <w:lastRenderedPageBreak/>
         <w:t>8.5 Worked example</w:t>
@@ -8576,7 +8576,7 @@
         <w:keepNext/>
         <w:spacing w:before="360"/>
       </w:pPr>
-      <w:bookmarkStart w:id="24" w:name="_Toc243254892"/>
+      <w:bookmarkStart w:id="24" w:name="_Toc243261783"/>
       <w:r>
         <w:t>9. Snapshots of the System</w:t>
       </w:r>
@@ -8593,10 +8593,10 @@
           <w:noProof/>
         </w:rPr>
         <w:drawing>
-          <wp:inline distT="0" distB="0" distL="0" distR="0" wp14:anchorId="46916285" wp14:editId="527D5E7C">
+          <wp:inline distT="0" distB="0" distL="0" distR="0" wp14:anchorId="37DF45E7" wp14:editId="0B897CB2">
             <wp:extent cx="4476750" cy="4152900"/>
             <wp:effectExtent l="0" t="0" r="0" b="0"/>
-            <wp:docPr id="10991716" name="Picture 10991716"/>
+            <wp:docPr id="2015224754" name="Picture 2015224754"/>
             <wp:cNvGraphicFramePr>
               <a:graphicFrameLocks xmlns:a="http://schemas.openxmlformats.org/drawingml/2006/main" noChangeAspect="1"/>
             </wp:cNvGraphicFramePr>
@@ -8659,10 +8659,10 @@
         </w:rPr>
         <w:lastRenderedPageBreak/>
         <w:drawing>
-          <wp:inline distT="0" distB="0" distL="0" distR="0" wp14:anchorId="2E9E908B" wp14:editId="141BE1A4">
+          <wp:inline distT="0" distB="0" distL="0" distR="0" wp14:anchorId="348180F9" wp14:editId="673D8ECC">
             <wp:extent cx="4953000" cy="3429000"/>
             <wp:effectExtent l="0" t="0" r="0" b="0"/>
-            <wp:docPr id="1887565054" name="Picture 1887565054"/>
+            <wp:docPr id="1486990694" name="Picture 1486990694"/>
             <wp:cNvGraphicFramePr>
               <a:graphicFrameLocks xmlns:a="http://schemas.openxmlformats.org/drawingml/2006/main" noChangeAspect="1"/>
             </wp:cNvGraphicFramePr>
@@ -8724,10 +8724,10 @@
           <w:noProof/>
         </w:rPr>
         <w:drawing>
-          <wp:inline distT="0" distB="0" distL="0" distR="0" wp14:anchorId="0CAC0C73" wp14:editId="3F665046">
+          <wp:inline distT="0" distB="0" distL="0" distR="0" wp14:anchorId="3F9C06BF" wp14:editId="5FBB90AC">
             <wp:extent cx="4476750" cy="4371975"/>
             <wp:effectExtent l="0" t="0" r="0" b="0"/>
-            <wp:docPr id="1839699254" name="Picture 1839699254"/>
+            <wp:docPr id="866493487" name="Picture 866493487"/>
             <wp:cNvGraphicFramePr>
               <a:graphicFrameLocks xmlns:a="http://schemas.openxmlformats.org/drawingml/2006/main" noChangeAspect="1"/>
             </wp:cNvGraphicFramePr>
@@ -8784,7 +8784,7 @@
         <w:keepNext/>
         <w:spacing w:before="360"/>
       </w:pPr>
-      <w:bookmarkStart w:id="25" w:name="_Toc243254893"/>
+      <w:bookmarkStart w:id="25" w:name="_Toc243261784"/>
       <w:r>
         <w:lastRenderedPageBreak/>
         <w:t>10. Applications, Limitations and Future Scope</w:t>
@@ -8796,7 +8796,7 @@
         <w:pStyle w:val="Heading2"/>
         <w:keepNext/>
       </w:pPr>
-      <w:bookmarkStart w:id="26" w:name="_Toc243254894"/>
+      <w:bookmarkStart w:id="26" w:name="_Toc243261785"/>
       <w:r>
         <w:t>10.1 Applications</w:t>
       </w:r>
@@ -8863,7 +8863,7 @@
         <w:pStyle w:val="Heading2"/>
         <w:keepNext/>
       </w:pPr>
-      <w:bookmarkStart w:id="27" w:name="_Toc243254895"/>
+      <w:bookmarkStart w:id="27" w:name="_Toc243261786"/>
       <w:r>
         <w:t>10.2 Limitations</w:t>
       </w:r>
@@ -8930,7 +8930,7 @@
         <w:pStyle w:val="Heading2"/>
         <w:keepNext/>
       </w:pPr>
-      <w:bookmarkStart w:id="28" w:name="_Toc243254896"/>
+      <w:bookmarkStart w:id="28" w:name="_Toc243261787"/>
       <w:r>
         <w:t>10.3 Future scope</w:t>
       </w:r>
@@ -8998,7 +8998,7 @@
         <w:keepNext/>
         <w:spacing w:before="360"/>
       </w:pPr>
-      <w:bookmarkStart w:id="29" w:name="_Toc243254897"/>
+      <w:bookmarkStart w:id="29" w:name="_Toc243261788"/>
       <w:r>
         <w:lastRenderedPageBreak/>
         <w:t>11. Project Plan</w:t>
@@ -10149,7 +10149,7 @@
         <w:keepNext/>
         <w:spacing w:before="360"/>
       </w:pPr>
-      <w:bookmarkStart w:id="30" w:name="_Toc243254898"/>
+      <w:bookmarkStart w:id="30" w:name="_Toc243261789"/>
       <w:r>
         <w:t>12. Conclusion</w:t>
       </w:r>
@@ -10173,7 +10173,7 @@
         <w:keepNext/>
         <w:pageBreakBefore/>
       </w:pPr>
-      <w:bookmarkStart w:id="31" w:name="_Toc243254899"/>
+      <w:bookmarkStart w:id="31" w:name="_Toc243261790"/>
       <w:r>
         <w:lastRenderedPageBreak/>
         <w:t>References</w:t>
@@ -10519,10 +10519,10 @@
 <file path=word/numbering.xml><?xml version="1.0" encoding="utf-8"?>
 <w:numbering xmlns:wpc="http://schemas.microsoft.com/office/word/2010/wordprocessingCanvas" xmlns:cx="http://schemas.microsoft.com/office/drawing/2014/chartex" xmlns:cx1="http://schemas.microsoft.com/office/drawing/2015/9/8/chartex" xmlns:cx2="http://schemas.microsoft.com/office/drawing/2015/10/21/chartex" xmlns:cx3="http://schemas.microsoft.com/office/drawing/2016/5/9/chartex" xmlns:cx4="http://schemas.microsoft.com/office/drawing/2016/5/10/chartex" xmlns:cx5="http://schemas.microsoft.com/office/drawing/2016/5/11/chartex" xmlns:cx6="http://schemas.microsoft.com/office/drawing/2016/5/12/chartex" xmlns:cx7="http://schemas.microsoft.com/office/drawing/2016/5/13/chartex" xmlns:cx8="http://schemas.microsoft.com/office/drawing/2016/5/14/chartex" xmlns:mc="http://schemas.openxmlformats.org/markup-compatibility/2006" xmlns:aink="http://schemas.microsoft.com/office/drawing/2016/ink" xmlns:am3d="http://schemas.microsoft.com/office/drawing/2017/model3d" xmlns:o="urn:schemas-microsoft-com:office:office" xmlns:oel="http://schemas.microsoft.com/office/2019/extlst" xmlns:r="http://schemas.openxmlformats.org/officeDocument/2006/relationships" xmlns:m="http://schemas.openxmlformats.org/officeDocument/2006/math" xmlns:v="urn:schemas-microsoft-com:vml" xmlns:wp14="http://schemas.microsoft.com/office/word/2010/wordprocessingDrawing" xmlns:wp="http://schemas.openxmlformats.org/drawingml/2006/wordprocessingDrawing" xmlns:w10="urn:schemas-microsoft-com:office:word" xmlns:w="http://schemas.openxmlformats.org/wordprocessingml/2006/main" xmlns:w14="http://schemas.microsoft.com/office/word/2010/wordml" xmlns:w15="http://schemas.microsoft.com/office/word/2012/wordml" xmlns:w16cex="http://schemas.microsoft.com/office/word/2018/wordml/cex" xmlns:w16cid="http://schemas.microsoft.com/office/word/2016/wordml/cid" xmlns:w16="http://schemas.microsoft.com/office/word/2018/wordml" xmlns:w16du="http://schemas.microsoft.com/office/word/2023/wordml/word16du" xmlns:w16sdtdh="http://schemas.microsoft.com/office/word/2020/wordml/sdtdatahash" xmlns:w16sdtfl="http://schemas.microsoft.com/office/word/2024/wordml/sdtformatlock" xmlns:w16se="http://schemas.microsoft.com/office/word/2015/wordml/symex" xmlns:wpg="http://schemas.microsoft.com/office/word/2010/wordprocessingGroup" xmlns:wpi="http://schemas.microsoft.com/office/word/2010/wordprocessingInk" xmlns:wne="http://schemas.microsoft.com/office/word/2006/wordml" xmlns:wps="http://schemas.microsoft.com/office/word/2010/wordprocessingShape" mc:Ignorable="w14 w15 w16se w16cid w16 w16cex w16sdtdh w16sdtfl w16du wp14">
   <w:abstractNum w:abstractNumId="0" w15:restartNumberingAfterBreak="0">
-    <w:nsid w:val="1BF94915"/>
+    <w:nsid w:val="3DD00A89"/>
     <w:multiLevelType w:val="hybridMultilevel"/>
-    <w:tmpl w:val="F746C494"/>
-    <w:lvl w:ilvl="0" w:tplc="F80C9DC6">
+    <w:tmpl w:val="935CA68A"/>
+    <w:lvl w:ilvl="0" w:tplc="64D6BBFA">
       <w:start w:val="1"/>
       <w:numFmt w:val="bullet"/>
       <w:lvlText w:val="•"/>
@@ -10531,52 +10531,52 @@
         <w:ind w:left="567" w:hanging="340"/>
       </w:pPr>
     </w:lvl>
-    <w:lvl w:ilvl="1" w:tplc="58C612D6">
+    <w:lvl w:ilvl="1" w:tplc="E81E66DE">
       <w:numFmt w:val="decimal"/>
       <w:lvlText w:val=""/>
       <w:lvlJc w:val="left"/>
     </w:lvl>
-    <w:lvl w:ilvl="2" w:tplc="E73A2254">
+    <w:lvl w:ilvl="2" w:tplc="C0483EF0">
       <w:numFmt w:val="decimal"/>
       <w:lvlText w:val=""/>
       <w:lvlJc w:val="left"/>
     </w:lvl>
-    <w:lvl w:ilvl="3" w:tplc="4DC8460C">
+    <w:lvl w:ilvl="3" w:tplc="0A9ED2EC">
       <w:numFmt w:val="decimal"/>
       <w:lvlText w:val=""/>
       <w:lvlJc w:val="left"/>
     </w:lvl>
-    <w:lvl w:ilvl="4" w:tplc="BE789B5A">
+    <w:lvl w:ilvl="4" w:tplc="398C375E">
       <w:numFmt w:val="decimal"/>
       <w:lvlText w:val=""/>
       <w:lvlJc w:val="left"/>
     </w:lvl>
-    <w:lvl w:ilvl="5" w:tplc="794CDBAE">
+    <w:lvl w:ilvl="5" w:tplc="732CC54E">
       <w:numFmt w:val="decimal"/>
       <w:lvlText w:val=""/>
       <w:lvlJc w:val="left"/>
     </w:lvl>
-    <w:lvl w:ilvl="6" w:tplc="2966A9CE">
+    <w:lvl w:ilvl="6" w:tplc="C2CCC494">
       <w:numFmt w:val="decimal"/>
       <w:lvlText w:val=""/>
       <w:lvlJc w:val="left"/>
     </w:lvl>
-    <w:lvl w:ilvl="7" w:tplc="AEF0D066">
+    <w:lvl w:ilvl="7" w:tplc="095A316A">
       <w:numFmt w:val="decimal"/>
       <w:lvlText w:val=""/>
       <w:lvlJc w:val="left"/>
     </w:lvl>
-    <w:lvl w:ilvl="8" w:tplc="52C0066C">
+    <w:lvl w:ilvl="8" w:tplc="32FEAC54">
       <w:numFmt w:val="decimal"/>
       <w:lvlText w:val=""/>
       <w:lvlJc w:val="left"/>
     </w:lvl>
   </w:abstractNum>
   <w:abstractNum w:abstractNumId="1" w15:restartNumberingAfterBreak="0">
-    <w:nsid w:val="359960C3"/>
+    <w:nsid w:val="54AC0195"/>
     <w:multiLevelType w:val="hybridMultilevel"/>
-    <w:tmpl w:val="BB10FDAE"/>
-    <w:lvl w:ilvl="0" w:tplc="9F52AF64">
+    <w:tmpl w:val="BAB0A06A"/>
+    <w:lvl w:ilvl="0" w:tplc="A296EB76">
       <w:start w:val="1"/>
       <w:numFmt w:val="decimal"/>
       <w:lvlText w:val="%1."/>
@@ -10585,52 +10585,52 @@
         <w:ind w:left="567" w:hanging="400"/>
       </w:pPr>
     </w:lvl>
-    <w:lvl w:ilvl="1" w:tplc="40EAD0E8">
+    <w:lvl w:ilvl="1" w:tplc="B1D81D0A">
       <w:numFmt w:val="decimal"/>
       <w:lvlText w:val=""/>
       <w:lvlJc w:val="left"/>
     </w:lvl>
-    <w:lvl w:ilvl="2" w:tplc="E9F27BF0">
+    <w:lvl w:ilvl="2" w:tplc="786A0050">
       <w:numFmt w:val="decimal"/>
       <w:lvlText w:val=""/>
       <w:lvlJc w:val="left"/>
     </w:lvl>
-    <w:lvl w:ilvl="3" w:tplc="3DEE3D9A">
+    <w:lvl w:ilvl="3" w:tplc="537E8DFE">
       <w:numFmt w:val="decimal"/>
       <w:lvlText w:val=""/>
       <w:lvlJc w:val="left"/>
     </w:lvl>
-    <w:lvl w:ilvl="4" w:tplc="A8F4155A">
+    <w:lvl w:ilvl="4" w:tplc="CF1CF8EC">
       <w:numFmt w:val="decimal"/>
       <w:lvlText w:val=""/>
       <w:lvlJc w:val="left"/>
     </w:lvl>
-    <w:lvl w:ilvl="5" w:tplc="5FD27818">
+    <w:lvl w:ilvl="5" w:tplc="01FC76CA">
       <w:numFmt w:val="decimal"/>
       <w:lvlText w:val=""/>
       <w:lvlJc w:val="left"/>
     </w:lvl>
-    <w:lvl w:ilvl="6" w:tplc="B0E27C30">
+    <w:lvl w:ilvl="6" w:tplc="B6A66FA8">
       <w:numFmt w:val="decimal"/>
       <w:lvlText w:val=""/>
       <w:lvlJc w:val="left"/>
     </w:lvl>
-    <w:lvl w:ilvl="7" w:tplc="E4ECF5D6">
+    <w:lvl w:ilvl="7" w:tplc="D9147DAE">
       <w:numFmt w:val="decimal"/>
       <w:lvlText w:val=""/>
       <w:lvlJc w:val="left"/>
     </w:lvl>
-    <w:lvl w:ilvl="8" w:tplc="D2CEBA7C">
+    <w:lvl w:ilvl="8" w:tplc="1D14030C">
       <w:numFmt w:val="decimal"/>
       <w:lvlText w:val=""/>
       <w:lvlJc w:val="left"/>
     </w:lvl>
   </w:abstractNum>
   <w:abstractNum w:abstractNumId="2" w15:restartNumberingAfterBreak="0">
-    <w:nsid w:val="62231EBD"/>
+    <w:nsid w:val="5F225ECD"/>
     <w:multiLevelType w:val="hybridMultilevel"/>
-    <w:tmpl w:val="B044B7B2"/>
-    <w:lvl w:ilvl="0" w:tplc="D5E8A76C">
+    <w:tmpl w:val="7BC83DEC"/>
+    <w:lvl w:ilvl="0" w:tplc="FEA0D4B2">
       <w:start w:val="1"/>
       <w:numFmt w:val="bullet"/>
       <w:lvlText w:val="●"/>
@@ -10639,7 +10639,7 @@
         <w:ind w:left="720" w:hanging="360"/>
       </w:pPr>
     </w:lvl>
-    <w:lvl w:ilvl="1" w:tplc="86F4E48E">
+    <w:lvl w:ilvl="1" w:tplc="50B8087A">
       <w:start w:val="1"/>
       <w:numFmt w:val="bullet"/>
       <w:lvlText w:val="○"/>
@@ -10648,7 +10648,7 @@
         <w:ind w:left="1440" w:hanging="360"/>
       </w:pPr>
     </w:lvl>
-    <w:lvl w:ilvl="2" w:tplc="DC96F636">
+    <w:lvl w:ilvl="2" w:tplc="94120CF4">
       <w:start w:val="1"/>
       <w:numFmt w:val="bullet"/>
       <w:lvlText w:val="■"/>
@@ -10657,7 +10657,7 @@
         <w:ind w:left="2160" w:hanging="360"/>
       </w:pPr>
     </w:lvl>
-    <w:lvl w:ilvl="3" w:tplc="1550DB7C">
+    <w:lvl w:ilvl="3" w:tplc="3284533A">
       <w:start w:val="1"/>
       <w:numFmt w:val="bullet"/>
       <w:lvlText w:val="●"/>
@@ -10666,7 +10666,7 @@
         <w:ind w:left="2880" w:hanging="360"/>
       </w:pPr>
     </w:lvl>
-    <w:lvl w:ilvl="4" w:tplc="B20AB644">
+    <w:lvl w:ilvl="4" w:tplc="299210F6">
       <w:start w:val="1"/>
       <w:numFmt w:val="bullet"/>
       <w:lvlText w:val="○"/>
@@ -10675,7 +10675,7 @@
         <w:ind w:left="3600" w:hanging="360"/>
       </w:pPr>
     </w:lvl>
-    <w:lvl w:ilvl="5" w:tplc="FF143758">
+    <w:lvl w:ilvl="5" w:tplc="FCB2C66E">
       <w:start w:val="1"/>
       <w:numFmt w:val="bullet"/>
       <w:lvlText w:val="■"/>
@@ -10684,7 +10684,7 @@
         <w:ind w:left="4320" w:hanging="360"/>
       </w:pPr>
     </w:lvl>
-    <w:lvl w:ilvl="6" w:tplc="B18254E8">
+    <w:lvl w:ilvl="6" w:tplc="0B9CB66C">
       <w:start w:val="1"/>
       <w:numFmt w:val="bullet"/>
       <w:lvlText w:val="●"/>
@@ -10693,7 +10693,7 @@
         <w:ind w:left="5040" w:hanging="360"/>
       </w:pPr>
     </w:lvl>
-    <w:lvl w:ilvl="7" w:tplc="A9E8D4A6">
+    <w:lvl w:ilvl="7" w:tplc="E91ECE20">
       <w:start w:val="1"/>
       <w:numFmt w:val="bullet"/>
       <w:lvlText w:val="●"/>
@@ -10702,7 +10702,7 @@
         <w:ind w:left="5760" w:hanging="360"/>
       </w:pPr>
     </w:lvl>
-    <w:lvl w:ilvl="8" w:tplc="63AAEBE8">
+    <w:lvl w:ilvl="8" w:tplc="232EFF88">
       <w:start w:val="1"/>
       <w:numFmt w:val="bullet"/>
       <w:lvlText w:val="●"/>
@@ -10712,19 +10712,19 @@
       </w:pPr>
     </w:lvl>
   </w:abstractNum>
-  <w:num w:numId="1" w16cid:durableId="742413616">
+  <w:num w:numId="1" w16cid:durableId="1077089764">
     <w:abstractNumId w:val="2"/>
     <w:lvlOverride w:ilvl="0">
       <w:startOverride w:val="1"/>
     </w:lvlOverride>
   </w:num>
-  <w:num w:numId="2" w16cid:durableId="2025015619">
+  <w:num w:numId="2" w16cid:durableId="1966616650">
     <w:abstractNumId w:val="0"/>
     <w:lvlOverride w:ilvl="0">
       <w:startOverride w:val="1"/>
     </w:lvlOverride>
   </w:num>
-  <w:num w:numId="3" w16cid:durableId="1071851732">
+  <w:num w:numId="3" w16cid:durableId="1532648368">
     <w:abstractNumId w:val="1"/>
     <w:lvlOverride w:ilvl="0">
       <w:startOverride w:val="1"/>
@@ -11311,7 +11311,7 @@
     <w:autoRedefine/>
     <w:uiPriority w:val="39"/>
     <w:unhideWhenUsed/>
-    <w:rsid w:val="004278E7"/>
+    <w:rsid w:val="00852A91"/>
     <w:pPr>
       <w:spacing w:after="100"/>
     </w:pPr>
@@ -11323,7 +11323,7 @@
     <w:autoRedefine/>
     <w:uiPriority w:val="39"/>
     <w:unhideWhenUsed/>
-    <w:rsid w:val="004278E7"/>
+    <w:rsid w:val="00852A91"/>
     <w:pPr>
       <w:spacing w:after="100"/>
       <w:ind w:left="240"/>

</xml_diff>